<commit_message>
feat: complete module 2, add database, scripts and backup
</commit_message>
<xml_diff>
--- a/repair-requests-module/module1/Пояснительная записка.docx
+++ b/repair-requests-module/module1/Пояснительная записка.docx
@@ -381,15 +381,7 @@
           <w:sz w:val="28"/>
           <w:szCs w:val="28"/>
         </w:rPr>
-        <w:t>у</w:t>
-      </w:r>
-      <w:r>
-        <w:rPr>
-          <w:rFonts w:ascii="Times New Roman" w:hAnsi="Times New Roman" w:cs="Times New Roman"/>
-          <w:sz w:val="28"/>
-          <w:szCs w:val="28"/>
-        </w:rPr>
-        <w:t>правление заявками</w:t>
+        <w:t>управление заявками</w:t>
       </w:r>
       <w:r>
         <w:rPr>
@@ -432,15 +424,7 @@
           <w:sz w:val="28"/>
           <w:szCs w:val="28"/>
         </w:rPr>
-        <w:t>р</w:t>
-      </w:r>
-      <w:r>
-        <w:rPr>
-          <w:rFonts w:ascii="Times New Roman" w:hAnsi="Times New Roman" w:cs="Times New Roman"/>
-          <w:sz w:val="28"/>
-          <w:szCs w:val="28"/>
-        </w:rPr>
-        <w:t>едактирование и учет</w:t>
+        <w:t>редактирование и учет</w:t>
       </w:r>
       <w:r>
         <w:rPr>
@@ -483,15 +467,7 @@
           <w:sz w:val="28"/>
           <w:szCs w:val="28"/>
         </w:rPr>
-        <w:t>с</w:t>
-      </w:r>
-      <w:r>
-        <w:rPr>
-          <w:rFonts w:ascii="Times New Roman" w:hAnsi="Times New Roman" w:cs="Times New Roman"/>
-          <w:sz w:val="28"/>
-          <w:szCs w:val="28"/>
-        </w:rPr>
-        <w:t>истема комментариев</w:t>
+        <w:t>система комментариев</w:t>
       </w:r>
       <w:r>
         <w:rPr>
@@ -1329,23 +1305,7 @@
           <w:sz w:val="28"/>
           <w:szCs w:val="28"/>
         </w:rPr>
-        <w:t>История коммитов</w:t>
-      </w:r>
-      <w:r>
-        <w:rPr>
-          <w:rFonts w:ascii="Times New Roman" w:hAnsi="Times New Roman" w:cs="Times New Roman"/>
-          <w:sz w:val="28"/>
-          <w:szCs w:val="28"/>
-        </w:rPr>
-        <w:t>: отражает</w:t>
-      </w:r>
-      <w:r>
-        <w:rPr>
-          <w:rFonts w:ascii="Times New Roman" w:hAnsi="Times New Roman" w:cs="Times New Roman"/>
-          <w:sz w:val="28"/>
-          <w:szCs w:val="28"/>
-        </w:rPr>
-        <w:t xml:space="preserve"> поэтапное выполнение задач: от настройки структуры проекта до реализации функций сохранения и отладки импортов.</w:t>
+        <w:t>История коммитов: отражает поэтапное выполнение задач: от настройки структуры проекта до реализации функций сохранения и отладки импортов.</w:t>
       </w:r>
     </w:p>
     <w:p>
@@ -1472,11 +1432,6 @@
         <w:spacing w:after="0" w:line="360" w:lineRule="auto"/>
         <w:ind w:firstLine="709"/>
         <w:jc w:val="both"/>
-        <w:rPr>
-          <w:rFonts w:ascii="Times New Roman" w:hAnsi="Times New Roman" w:cs="Times New Roman"/>
-          <w:sz w:val="28"/>
-          <w:szCs w:val="28"/>
-        </w:rPr>
       </w:pPr>
       <w:r>
         <w:rPr>
@@ -1492,6 +1447,379 @@
         </w:rPr>
         <w:t>: Сделай скриншот окна логина, главного окна с таблицей и окна редактирования. Вставь их в отчет после соответствующих описаний.</w:t>
       </w:r>
+    </w:p>
+    <w:p>
+      <w:pPr>
+        <w:spacing w:before="100" w:beforeAutospacing="1" w:after="100" w:afterAutospacing="1" w:line="240" w:lineRule="auto"/>
+        <w:outlineLvl w:val="2"/>
+        <w:rPr>
+          <w:rFonts w:ascii="Times New Roman" w:eastAsia="Times New Roman" w:hAnsi="Times New Roman" w:cs="Times New Roman"/>
+          <w:b/>
+          <w:bCs/>
+          <w:sz w:val="27"/>
+          <w:szCs w:val="27"/>
+          <w:highlight w:val="yellow"/>
+          <w:lang w:eastAsia="ru-RU"/>
+        </w:rPr>
+      </w:pPr>
+      <w:r>
+        <w:rPr>
+          <w:rFonts w:ascii="Times New Roman" w:eastAsia="Times New Roman" w:hAnsi="Times New Roman" w:cs="Times New Roman"/>
+          <w:b/>
+          <w:bCs/>
+          <w:sz w:val="27"/>
+          <w:szCs w:val="27"/>
+          <w:highlight w:val="yellow"/>
+          <w:lang w:eastAsia="ru-RU"/>
+        </w:rPr>
+        <w:t>3. Как показать (Скриншоты «До и После»)</w:t>
+      </w:r>
+    </w:p>
+    <w:p>
+      <w:pPr>
+        <w:spacing w:before="100" w:beforeAutospacing="1" w:after="100" w:afterAutospacing="1" w:line="240" w:lineRule="auto"/>
+        <w:rPr>
+          <w:rFonts w:ascii="Times New Roman" w:eastAsia="Times New Roman" w:hAnsi="Times New Roman" w:cs="Times New Roman"/>
+          <w:sz w:val="24"/>
+          <w:szCs w:val="24"/>
+          <w:highlight w:val="yellow"/>
+          <w:lang w:eastAsia="ru-RU"/>
+        </w:rPr>
+      </w:pPr>
+      <w:r>
+        <w:rPr>
+          <w:rFonts w:ascii="Times New Roman" w:eastAsia="Times New Roman" w:hAnsi="Times New Roman" w:cs="Times New Roman"/>
+          <w:sz w:val="24"/>
+          <w:szCs w:val="24"/>
+          <w:highlight w:val="yellow"/>
+          <w:lang w:eastAsia="ru-RU"/>
+        </w:rPr>
+        <w:t>Визуальные доказательства лучше всего вставлять парами.</w:t>
+      </w:r>
+    </w:p>
+    <w:p>
+      <w:pPr>
+        <w:numPr>
+          <w:ilvl w:val="0"/>
+          <w:numId w:val="3"/>
+        </w:numPr>
+        <w:spacing w:before="100" w:beforeAutospacing="1" w:after="100" w:afterAutospacing="1" w:line="240" w:lineRule="auto"/>
+        <w:rPr>
+          <w:rFonts w:ascii="Times New Roman" w:eastAsia="Times New Roman" w:hAnsi="Times New Roman" w:cs="Times New Roman"/>
+          <w:sz w:val="24"/>
+          <w:szCs w:val="24"/>
+          <w:highlight w:val="yellow"/>
+          <w:lang w:eastAsia="ru-RU"/>
+        </w:rPr>
+      </w:pPr>
+      <w:r>
+        <w:rPr>
+          <w:rFonts w:ascii="Times New Roman" w:eastAsia="Times New Roman" w:hAnsi="Times New Roman" w:cs="Times New Roman"/>
+          <w:b/>
+          <w:bCs/>
+          <w:sz w:val="24"/>
+          <w:szCs w:val="24"/>
+          <w:highlight w:val="yellow"/>
+          <w:lang w:eastAsia="ru-RU"/>
+        </w:rPr>
+        <w:t>Скриншот 1: Окно авторизации.</w:t>
+      </w:r>
+      <w:r>
+        <w:rPr>
+          <w:rFonts w:ascii="Times New Roman" w:eastAsia="Times New Roman" w:hAnsi="Times New Roman" w:cs="Times New Roman"/>
+          <w:sz w:val="24"/>
+          <w:szCs w:val="24"/>
+          <w:highlight w:val="yellow"/>
+          <w:lang w:eastAsia="ru-RU"/>
+        </w:rPr>
+        <w:t xml:space="preserve"> Покажи введенный логин и «звездочки» в поле пароля. Подпиши: </w:t>
+      </w:r>
+      <w:r>
+        <w:rPr>
+          <w:rFonts w:ascii="Times New Roman" w:eastAsia="Times New Roman" w:hAnsi="Times New Roman" w:cs="Times New Roman"/>
+          <w:i/>
+          <w:iCs/>
+          <w:sz w:val="24"/>
+          <w:szCs w:val="24"/>
+          <w:highlight w:val="yellow"/>
+          <w:lang w:eastAsia="ru-RU"/>
+        </w:rPr>
+        <w:t>«Рис. 1 — Реализация требования ТЗ 3.2 по защите персональных данных»</w:t>
+      </w:r>
+      <w:r>
+        <w:rPr>
+          <w:rFonts w:ascii="Times New Roman" w:eastAsia="Times New Roman" w:hAnsi="Times New Roman" w:cs="Times New Roman"/>
+          <w:sz w:val="24"/>
+          <w:szCs w:val="24"/>
+          <w:highlight w:val="yellow"/>
+          <w:lang w:eastAsia="ru-RU"/>
+        </w:rPr>
+        <w:t>.</w:t>
+      </w:r>
+    </w:p>
+    <w:p>
+      <w:pPr>
+        <w:numPr>
+          <w:ilvl w:val="0"/>
+          <w:numId w:val="3"/>
+        </w:numPr>
+        <w:spacing w:before="100" w:beforeAutospacing="1" w:after="100" w:afterAutospacing="1" w:line="240" w:lineRule="auto"/>
+        <w:rPr>
+          <w:rFonts w:ascii="Times New Roman" w:eastAsia="Times New Roman" w:hAnsi="Times New Roman" w:cs="Times New Roman"/>
+          <w:sz w:val="24"/>
+          <w:szCs w:val="24"/>
+          <w:highlight w:val="yellow"/>
+          <w:lang w:eastAsia="ru-RU"/>
+        </w:rPr>
+      </w:pPr>
+      <w:r>
+        <w:rPr>
+          <w:rFonts w:ascii="Times New Roman" w:eastAsia="Times New Roman" w:hAnsi="Times New Roman" w:cs="Times New Roman"/>
+          <w:b/>
+          <w:bCs/>
+          <w:sz w:val="24"/>
+          <w:szCs w:val="24"/>
+          <w:highlight w:val="yellow"/>
+          <w:lang w:eastAsia="ru-RU"/>
+        </w:rPr>
+        <w:t>Скриншот 2: Главное окно.</w:t>
+      </w:r>
+      <w:r>
+        <w:rPr>
+          <w:rFonts w:ascii="Times New Roman" w:eastAsia="Times New Roman" w:hAnsi="Times New Roman" w:cs="Times New Roman"/>
+          <w:sz w:val="24"/>
+          <w:szCs w:val="24"/>
+          <w:highlight w:val="yellow"/>
+          <w:lang w:eastAsia="ru-RU"/>
+        </w:rPr>
+        <w:t xml:space="preserve"> Покажи, что таблица заполнена данными.</w:t>
+      </w:r>
+    </w:p>
+    <w:p>
+      <w:pPr>
+        <w:numPr>
+          <w:ilvl w:val="0"/>
+          <w:numId w:val="3"/>
+        </w:numPr>
+        <w:spacing w:before="100" w:beforeAutospacing="1" w:after="100" w:afterAutospacing="1" w:line="240" w:lineRule="auto"/>
+        <w:rPr>
+          <w:rFonts w:ascii="Times New Roman" w:eastAsia="Times New Roman" w:hAnsi="Times New Roman" w:cs="Times New Roman"/>
+          <w:sz w:val="24"/>
+          <w:szCs w:val="24"/>
+          <w:highlight w:val="yellow"/>
+          <w:lang w:eastAsia="ru-RU"/>
+        </w:rPr>
+      </w:pPr>
+      <w:r>
+        <w:rPr>
+          <w:rFonts w:ascii="Times New Roman" w:eastAsia="Times New Roman" w:hAnsi="Times New Roman" w:cs="Times New Roman"/>
+          <w:b/>
+          <w:bCs/>
+          <w:sz w:val="24"/>
+          <w:szCs w:val="24"/>
+          <w:highlight w:val="yellow"/>
+          <w:lang w:eastAsia="ru-RU"/>
+        </w:rPr>
+        <w:lastRenderedPageBreak/>
+        <w:t>Скриншот 3: Проверка файла.</w:t>
+      </w:r>
+      <w:r>
+        <w:rPr>
+          <w:rFonts w:ascii="Times New Roman" w:eastAsia="Times New Roman" w:hAnsi="Times New Roman" w:cs="Times New Roman"/>
+          <w:sz w:val="24"/>
+          <w:szCs w:val="24"/>
+          <w:highlight w:val="yellow"/>
+          <w:lang w:eastAsia="ru-RU"/>
+        </w:rPr>
+        <w:t xml:space="preserve"> Открой </w:t>
+      </w:r>
+      <w:r>
+        <w:rPr>
+          <w:rFonts w:ascii="Courier New" w:eastAsia="Times New Roman" w:hAnsi="Courier New" w:cs="Courier New"/>
+          <w:sz w:val="20"/>
+          <w:szCs w:val="20"/>
+          <w:highlight w:val="yellow"/>
+          <w:lang w:eastAsia="ru-RU"/>
+        </w:rPr>
+        <w:t>inputDataRequests.csv</w:t>
+      </w:r>
+      <w:r>
+        <w:rPr>
+          <w:rFonts w:ascii="Times New Roman" w:eastAsia="Times New Roman" w:hAnsi="Times New Roman" w:cs="Times New Roman"/>
+          <w:sz w:val="24"/>
+          <w:szCs w:val="24"/>
+          <w:highlight w:val="yellow"/>
+          <w:lang w:eastAsia="ru-RU"/>
+        </w:rPr>
+        <w:t xml:space="preserve"> в Блокноте </w:t>
+      </w:r>
+      <w:r>
+        <w:rPr>
+          <w:rFonts w:ascii="Times New Roman" w:eastAsia="Times New Roman" w:hAnsi="Times New Roman" w:cs="Times New Roman"/>
+          <w:b/>
+          <w:bCs/>
+          <w:sz w:val="24"/>
+          <w:szCs w:val="24"/>
+          <w:highlight w:val="yellow"/>
+          <w:lang w:eastAsia="ru-RU"/>
+        </w:rPr>
+        <w:t>после</w:t>
+      </w:r>
+      <w:r>
+        <w:rPr>
+          <w:rFonts w:ascii="Times New Roman" w:eastAsia="Times New Roman" w:hAnsi="Times New Roman" w:cs="Times New Roman"/>
+          <w:sz w:val="24"/>
+          <w:szCs w:val="24"/>
+          <w:highlight w:val="yellow"/>
+          <w:lang w:eastAsia="ru-RU"/>
+        </w:rPr>
+        <w:t xml:space="preserve"> того, как ты изменила что-то в программе. Выдели измененную строку маркером. Подпиши: </w:t>
+      </w:r>
+      <w:r>
+        <w:rPr>
+          <w:rFonts w:ascii="Times New Roman" w:eastAsia="Times New Roman" w:hAnsi="Times New Roman" w:cs="Times New Roman"/>
+          <w:i/>
+          <w:iCs/>
+          <w:sz w:val="24"/>
+          <w:szCs w:val="24"/>
+          <w:highlight w:val="yellow"/>
+          <w:lang w:eastAsia="ru-RU"/>
+        </w:rPr>
+        <w:t>«Рис. 2 — Подтверждение успешной синхронизации данных с файловой базой»</w:t>
+      </w:r>
+      <w:r>
+        <w:rPr>
+          <w:rFonts w:ascii="Times New Roman" w:eastAsia="Times New Roman" w:hAnsi="Times New Roman" w:cs="Times New Roman"/>
+          <w:sz w:val="24"/>
+          <w:szCs w:val="24"/>
+          <w:highlight w:val="yellow"/>
+          <w:lang w:eastAsia="ru-RU"/>
+        </w:rPr>
+        <w:t>.</w:t>
+      </w:r>
+    </w:p>
+    <w:p>
+      <w:pPr>
+        <w:spacing w:before="100" w:beforeAutospacing="1" w:after="100" w:afterAutospacing="1" w:line="240" w:lineRule="auto"/>
+        <w:outlineLvl w:val="2"/>
+        <w:rPr>
+          <w:rFonts w:ascii="Times New Roman" w:eastAsia="Times New Roman" w:hAnsi="Times New Roman" w:cs="Times New Roman"/>
+          <w:b/>
+          <w:bCs/>
+          <w:sz w:val="27"/>
+          <w:szCs w:val="27"/>
+          <w:highlight w:val="yellow"/>
+          <w:lang w:eastAsia="ru-RU"/>
+        </w:rPr>
+      </w:pPr>
+      <w:r>
+        <w:rPr>
+          <w:rFonts w:ascii="Times New Roman" w:eastAsia="Times New Roman" w:hAnsi="Times New Roman" w:cs="Times New Roman"/>
+          <w:b/>
+          <w:bCs/>
+          <w:sz w:val="27"/>
+          <w:szCs w:val="27"/>
+          <w:highlight w:val="yellow"/>
+          <w:lang w:eastAsia="ru-RU"/>
+        </w:rPr>
+        <w:t>4. Описание обработки ошибок (ТЗ 3.3)</w:t>
+      </w:r>
+    </w:p>
+    <w:p>
+      <w:pPr>
+        <w:spacing w:before="100" w:beforeAutospacing="1" w:after="100" w:afterAutospacing="1" w:line="240" w:lineRule="auto"/>
+        <w:rPr>
+          <w:rFonts w:ascii="Times New Roman" w:eastAsia="Times New Roman" w:hAnsi="Times New Roman" w:cs="Times New Roman"/>
+          <w:sz w:val="24"/>
+          <w:szCs w:val="24"/>
+          <w:highlight w:val="yellow"/>
+          <w:lang w:eastAsia="ru-RU"/>
+        </w:rPr>
+      </w:pPr>
+      <w:r>
+        <w:rPr>
+          <w:rFonts w:ascii="Times New Roman" w:eastAsia="Times New Roman" w:hAnsi="Times New Roman" w:cs="Times New Roman"/>
+          <w:sz w:val="24"/>
+          <w:szCs w:val="24"/>
+          <w:highlight w:val="yellow"/>
+          <w:lang w:eastAsia="ru-RU"/>
+        </w:rPr>
+        <w:t>Отдельно упомяни, что программа не «падает» при ошибках.</w:t>
+      </w:r>
+    </w:p>
+    <w:p>
+      <w:pPr>
+        <w:numPr>
+          <w:ilvl w:val="0"/>
+          <w:numId w:val="4"/>
+        </w:numPr>
+        <w:spacing w:before="100" w:beforeAutospacing="1" w:after="100" w:afterAutospacing="1" w:line="240" w:lineRule="auto"/>
+        <w:rPr>
+          <w:rFonts w:ascii="Times New Roman" w:eastAsia="Times New Roman" w:hAnsi="Times New Roman" w:cs="Times New Roman"/>
+          <w:sz w:val="24"/>
+          <w:szCs w:val="24"/>
+          <w:highlight w:val="yellow"/>
+          <w:lang w:eastAsia="ru-RU"/>
+        </w:rPr>
+      </w:pPr>
+      <w:r>
+        <w:rPr>
+          <w:rFonts w:ascii="Times New Roman" w:eastAsia="Times New Roman" w:hAnsi="Times New Roman" w:cs="Times New Roman"/>
+          <w:b/>
+          <w:bCs/>
+          <w:sz w:val="24"/>
+          <w:szCs w:val="24"/>
+          <w:highlight w:val="yellow"/>
+          <w:lang w:eastAsia="ru-RU"/>
+        </w:rPr>
+        <w:t>Пример:</w:t>
+      </w:r>
+      <w:r>
+        <w:rPr>
+          <w:rFonts w:ascii="Times New Roman" w:eastAsia="Times New Roman" w:hAnsi="Times New Roman" w:cs="Times New Roman"/>
+          <w:sz w:val="24"/>
+          <w:szCs w:val="24"/>
+          <w:highlight w:val="yellow"/>
+          <w:lang w:eastAsia="ru-RU"/>
+        </w:rPr>
+        <w:t xml:space="preserve"> «При вводе неверного пароля система выводит диалоговое окно </w:t>
+      </w:r>
+      <w:proofErr w:type="spellStart"/>
+      <w:proofErr w:type="gramStart"/>
+      <w:r>
+        <w:rPr>
+          <w:rFonts w:ascii="Courier New" w:eastAsia="Times New Roman" w:hAnsi="Courier New" w:cs="Courier New"/>
+          <w:sz w:val="20"/>
+          <w:szCs w:val="20"/>
+          <w:highlight w:val="yellow"/>
+          <w:lang w:eastAsia="ru-RU"/>
+        </w:rPr>
+        <w:t>messagebox.showerror</w:t>
+      </w:r>
+      <w:proofErr w:type="spellEnd"/>
+      <w:proofErr w:type="gramEnd"/>
+      <w:r>
+        <w:rPr>
+          <w:rFonts w:ascii="Times New Roman" w:eastAsia="Times New Roman" w:hAnsi="Times New Roman" w:cs="Times New Roman"/>
+          <w:sz w:val="24"/>
+          <w:szCs w:val="24"/>
+          <w:highlight w:val="yellow"/>
+          <w:lang w:eastAsia="ru-RU"/>
+        </w:rPr>
+        <w:t>, предотвращая несанкционированный доступ и некорректное завершение процесса».</w:t>
+      </w:r>
+    </w:p>
+    <w:p>
+      <w:pPr>
+        <w:spacing w:after="0" w:line="360" w:lineRule="auto"/>
+        <w:ind w:firstLine="709"/>
+        <w:jc w:val="both"/>
+        <w:rPr>
+          <w:rFonts w:ascii="Times New Roman" w:hAnsi="Times New Roman" w:cs="Times New Roman"/>
+          <w:sz w:val="28"/>
+          <w:szCs w:val="28"/>
+        </w:rPr>
+      </w:pPr>
     </w:p>
     <w:sectPr>
       <w:pgSz w:w="11906" w:h="16838"/>
@@ -1655,6 +1983,155 @@
     </w:lvl>
   </w:abstractNum>
   <w:abstractNum w:abstractNumId="1" w15:restartNumberingAfterBreak="0">
+    <w:nsid w:val="42532B51"/>
+    <w:multiLevelType w:val="multilevel"/>
+    <w:tmpl w:val="F3A0E4AA"/>
+    <w:lvl w:ilvl="0">
+      <w:start w:val="1"/>
+      <w:numFmt w:val="bullet"/>
+      <w:lvlText w:val=""/>
+      <w:lvlJc w:val="left"/>
+      <w:pPr>
+        <w:tabs>
+          <w:tab w:val="num" w:pos="720"/>
+        </w:tabs>
+        <w:ind w:left="720" w:hanging="360"/>
+      </w:pPr>
+      <w:rPr>
+        <w:rFonts w:ascii="Symbol" w:hAnsi="Symbol" w:hint="default"/>
+        <w:sz w:val="20"/>
+      </w:rPr>
+    </w:lvl>
+    <w:lvl w:ilvl="1" w:tentative="1">
+      <w:start w:val="1"/>
+      <w:numFmt w:val="bullet"/>
+      <w:lvlText w:val="o"/>
+      <w:lvlJc w:val="left"/>
+      <w:pPr>
+        <w:tabs>
+          <w:tab w:val="num" w:pos="1440"/>
+        </w:tabs>
+        <w:ind w:left="1440" w:hanging="360"/>
+      </w:pPr>
+      <w:rPr>
+        <w:rFonts w:ascii="Courier New" w:hAnsi="Courier New" w:hint="default"/>
+        <w:sz w:val="20"/>
+      </w:rPr>
+    </w:lvl>
+    <w:lvl w:ilvl="2" w:tentative="1">
+      <w:start w:val="1"/>
+      <w:numFmt w:val="bullet"/>
+      <w:lvlText w:val=""/>
+      <w:lvlJc w:val="left"/>
+      <w:pPr>
+        <w:tabs>
+          <w:tab w:val="num" w:pos="2160"/>
+        </w:tabs>
+        <w:ind w:left="2160" w:hanging="360"/>
+      </w:pPr>
+      <w:rPr>
+        <w:rFonts w:ascii="Wingdings" w:hAnsi="Wingdings" w:hint="default"/>
+        <w:sz w:val="20"/>
+      </w:rPr>
+    </w:lvl>
+    <w:lvl w:ilvl="3" w:tentative="1">
+      <w:start w:val="1"/>
+      <w:numFmt w:val="bullet"/>
+      <w:lvlText w:val=""/>
+      <w:lvlJc w:val="left"/>
+      <w:pPr>
+        <w:tabs>
+          <w:tab w:val="num" w:pos="2880"/>
+        </w:tabs>
+        <w:ind w:left="2880" w:hanging="360"/>
+      </w:pPr>
+      <w:rPr>
+        <w:rFonts w:ascii="Wingdings" w:hAnsi="Wingdings" w:hint="default"/>
+        <w:sz w:val="20"/>
+      </w:rPr>
+    </w:lvl>
+    <w:lvl w:ilvl="4" w:tentative="1">
+      <w:start w:val="1"/>
+      <w:numFmt w:val="bullet"/>
+      <w:lvlText w:val=""/>
+      <w:lvlJc w:val="left"/>
+      <w:pPr>
+        <w:tabs>
+          <w:tab w:val="num" w:pos="3600"/>
+        </w:tabs>
+        <w:ind w:left="3600" w:hanging="360"/>
+      </w:pPr>
+      <w:rPr>
+        <w:rFonts w:ascii="Wingdings" w:hAnsi="Wingdings" w:hint="default"/>
+        <w:sz w:val="20"/>
+      </w:rPr>
+    </w:lvl>
+    <w:lvl w:ilvl="5" w:tentative="1">
+      <w:start w:val="1"/>
+      <w:numFmt w:val="bullet"/>
+      <w:lvlText w:val=""/>
+      <w:lvlJc w:val="left"/>
+      <w:pPr>
+        <w:tabs>
+          <w:tab w:val="num" w:pos="4320"/>
+        </w:tabs>
+        <w:ind w:left="4320" w:hanging="360"/>
+      </w:pPr>
+      <w:rPr>
+        <w:rFonts w:ascii="Wingdings" w:hAnsi="Wingdings" w:hint="default"/>
+        <w:sz w:val="20"/>
+      </w:rPr>
+    </w:lvl>
+    <w:lvl w:ilvl="6" w:tentative="1">
+      <w:start w:val="1"/>
+      <w:numFmt w:val="bullet"/>
+      <w:lvlText w:val=""/>
+      <w:lvlJc w:val="left"/>
+      <w:pPr>
+        <w:tabs>
+          <w:tab w:val="num" w:pos="5040"/>
+        </w:tabs>
+        <w:ind w:left="5040" w:hanging="360"/>
+      </w:pPr>
+      <w:rPr>
+        <w:rFonts w:ascii="Wingdings" w:hAnsi="Wingdings" w:hint="default"/>
+        <w:sz w:val="20"/>
+      </w:rPr>
+    </w:lvl>
+    <w:lvl w:ilvl="7" w:tentative="1">
+      <w:start w:val="1"/>
+      <w:numFmt w:val="bullet"/>
+      <w:lvlText w:val=""/>
+      <w:lvlJc w:val="left"/>
+      <w:pPr>
+        <w:tabs>
+          <w:tab w:val="num" w:pos="5760"/>
+        </w:tabs>
+        <w:ind w:left="5760" w:hanging="360"/>
+      </w:pPr>
+      <w:rPr>
+        <w:rFonts w:ascii="Wingdings" w:hAnsi="Wingdings" w:hint="default"/>
+        <w:sz w:val="20"/>
+      </w:rPr>
+    </w:lvl>
+    <w:lvl w:ilvl="8" w:tentative="1">
+      <w:start w:val="1"/>
+      <w:numFmt w:val="bullet"/>
+      <w:lvlText w:val=""/>
+      <w:lvlJc w:val="left"/>
+      <w:pPr>
+        <w:tabs>
+          <w:tab w:val="num" w:pos="6480"/>
+        </w:tabs>
+        <w:ind w:left="6480" w:hanging="360"/>
+      </w:pPr>
+      <w:rPr>
+        <w:rFonts w:ascii="Wingdings" w:hAnsi="Wingdings" w:hint="default"/>
+        <w:sz w:val="20"/>
+      </w:rPr>
+    </w:lvl>
+  </w:abstractNum>
+  <w:abstractNum w:abstractNumId="2" w15:restartNumberingAfterBreak="0">
     <w:nsid w:val="58A748B1"/>
     <w:multiLevelType w:val="multilevel"/>
     <w:tmpl w:val="8DAA2D36"/>
@@ -1662,6 +2139,155 @@
       <w:start w:val="1"/>
       <w:numFmt w:val="bullet"/>
       <w:lvlText w:val=""/>
+      <w:lvlJc w:val="left"/>
+      <w:pPr>
+        <w:tabs>
+          <w:tab w:val="num" w:pos="720"/>
+        </w:tabs>
+        <w:ind w:left="720" w:hanging="360"/>
+      </w:pPr>
+      <w:rPr>
+        <w:rFonts w:ascii="Symbol" w:hAnsi="Symbol" w:hint="default"/>
+        <w:sz w:val="20"/>
+      </w:rPr>
+    </w:lvl>
+    <w:lvl w:ilvl="1" w:tentative="1">
+      <w:start w:val="1"/>
+      <w:numFmt w:val="bullet"/>
+      <w:lvlText w:val="o"/>
+      <w:lvlJc w:val="left"/>
+      <w:pPr>
+        <w:tabs>
+          <w:tab w:val="num" w:pos="1440"/>
+        </w:tabs>
+        <w:ind w:left="1440" w:hanging="360"/>
+      </w:pPr>
+      <w:rPr>
+        <w:rFonts w:ascii="Courier New" w:hAnsi="Courier New" w:hint="default"/>
+        <w:sz w:val="20"/>
+      </w:rPr>
+    </w:lvl>
+    <w:lvl w:ilvl="2" w:tentative="1">
+      <w:start w:val="1"/>
+      <w:numFmt w:val="bullet"/>
+      <w:lvlText w:val=""/>
+      <w:lvlJc w:val="left"/>
+      <w:pPr>
+        <w:tabs>
+          <w:tab w:val="num" w:pos="2160"/>
+        </w:tabs>
+        <w:ind w:left="2160" w:hanging="360"/>
+      </w:pPr>
+      <w:rPr>
+        <w:rFonts w:ascii="Wingdings" w:hAnsi="Wingdings" w:hint="default"/>
+        <w:sz w:val="20"/>
+      </w:rPr>
+    </w:lvl>
+    <w:lvl w:ilvl="3" w:tentative="1">
+      <w:start w:val="1"/>
+      <w:numFmt w:val="bullet"/>
+      <w:lvlText w:val=""/>
+      <w:lvlJc w:val="left"/>
+      <w:pPr>
+        <w:tabs>
+          <w:tab w:val="num" w:pos="2880"/>
+        </w:tabs>
+        <w:ind w:left="2880" w:hanging="360"/>
+      </w:pPr>
+      <w:rPr>
+        <w:rFonts w:ascii="Wingdings" w:hAnsi="Wingdings" w:hint="default"/>
+        <w:sz w:val="20"/>
+      </w:rPr>
+    </w:lvl>
+    <w:lvl w:ilvl="4" w:tentative="1">
+      <w:start w:val="1"/>
+      <w:numFmt w:val="bullet"/>
+      <w:lvlText w:val=""/>
+      <w:lvlJc w:val="left"/>
+      <w:pPr>
+        <w:tabs>
+          <w:tab w:val="num" w:pos="3600"/>
+        </w:tabs>
+        <w:ind w:left="3600" w:hanging="360"/>
+      </w:pPr>
+      <w:rPr>
+        <w:rFonts w:ascii="Wingdings" w:hAnsi="Wingdings" w:hint="default"/>
+        <w:sz w:val="20"/>
+      </w:rPr>
+    </w:lvl>
+    <w:lvl w:ilvl="5" w:tentative="1">
+      <w:start w:val="1"/>
+      <w:numFmt w:val="bullet"/>
+      <w:lvlText w:val=""/>
+      <w:lvlJc w:val="left"/>
+      <w:pPr>
+        <w:tabs>
+          <w:tab w:val="num" w:pos="4320"/>
+        </w:tabs>
+        <w:ind w:left="4320" w:hanging="360"/>
+      </w:pPr>
+      <w:rPr>
+        <w:rFonts w:ascii="Wingdings" w:hAnsi="Wingdings" w:hint="default"/>
+        <w:sz w:val="20"/>
+      </w:rPr>
+    </w:lvl>
+    <w:lvl w:ilvl="6" w:tentative="1">
+      <w:start w:val="1"/>
+      <w:numFmt w:val="bullet"/>
+      <w:lvlText w:val=""/>
+      <w:lvlJc w:val="left"/>
+      <w:pPr>
+        <w:tabs>
+          <w:tab w:val="num" w:pos="5040"/>
+        </w:tabs>
+        <w:ind w:left="5040" w:hanging="360"/>
+      </w:pPr>
+      <w:rPr>
+        <w:rFonts w:ascii="Wingdings" w:hAnsi="Wingdings" w:hint="default"/>
+        <w:sz w:val="20"/>
+      </w:rPr>
+    </w:lvl>
+    <w:lvl w:ilvl="7" w:tentative="1">
+      <w:start w:val="1"/>
+      <w:numFmt w:val="bullet"/>
+      <w:lvlText w:val=""/>
+      <w:lvlJc w:val="left"/>
+      <w:pPr>
+        <w:tabs>
+          <w:tab w:val="num" w:pos="5760"/>
+        </w:tabs>
+        <w:ind w:left="5760" w:hanging="360"/>
+      </w:pPr>
+      <w:rPr>
+        <w:rFonts w:ascii="Wingdings" w:hAnsi="Wingdings" w:hint="default"/>
+        <w:sz w:val="20"/>
+      </w:rPr>
+    </w:lvl>
+    <w:lvl w:ilvl="8" w:tentative="1">
+      <w:start w:val="1"/>
+      <w:numFmt w:val="bullet"/>
+      <w:lvlText w:val=""/>
+      <w:lvlJc w:val="left"/>
+      <w:pPr>
+        <w:tabs>
+          <w:tab w:val="num" w:pos="6480"/>
+        </w:tabs>
+        <w:ind w:left="6480" w:hanging="360"/>
+      </w:pPr>
+      <w:rPr>
+        <w:rFonts w:ascii="Wingdings" w:hAnsi="Wingdings" w:hint="default"/>
+        <w:sz w:val="20"/>
+      </w:rPr>
+    </w:lvl>
+  </w:abstractNum>
+  <w:abstractNum w:abstractNumId="3" w15:restartNumberingAfterBreak="0">
+    <w:nsid w:val="65B23166"/>
+    <w:multiLevelType w:val="multilevel"/>
+    <w:tmpl w:val="AD5895BA"/>
+    <w:lvl w:ilvl="0">
+      <w:start w:val="1"/>
+      <w:numFmt w:val="bullet"/>
+      <w:lvlText w:val=""/>
       <w:lvlJc w:val="left"/>
       <w:pPr>
         <w:tabs>
@@ -1807,6 +2433,12 @@
     <w:abstractNumId w:val="0"/>
   </w:num>
   <w:num w:numId="2">
+    <w:abstractNumId w:val="2"/>
+  </w:num>
+  <w:num w:numId="3">
+    <w:abstractNumId w:val="3"/>
+  </w:num>
+  <w:num w:numId="4">
     <w:abstractNumId w:val="1"/>
   </w:num>
 </w:numbering>
@@ -2211,9 +2843,30 @@
     <w:name w:val="Normal"/>
     <w:qFormat/>
   </w:style>
+  <w:style w:type="paragraph" w:styleId="3">
+    <w:name w:val="heading 3"/>
+    <w:basedOn w:val="a"/>
+    <w:link w:val="30"/>
+    <w:uiPriority w:val="9"/>
+    <w:qFormat/>
+    <w:rsid w:val="00D40039"/>
+    <w:pPr>
+      <w:spacing w:before="100" w:beforeAutospacing="1" w:after="100" w:afterAutospacing="1" w:line="240" w:lineRule="auto"/>
+      <w:outlineLvl w:val="2"/>
+    </w:pPr>
+    <w:rPr>
+      <w:rFonts w:ascii="Times New Roman" w:eastAsia="Times New Roman" w:hAnsi="Times New Roman" w:cs="Times New Roman"/>
+      <w:b/>
+      <w:bCs/>
+      <w:sz w:val="27"/>
+      <w:szCs w:val="27"/>
+      <w:lang w:eastAsia="ru-RU"/>
+    </w:rPr>
+  </w:style>
   <w:style w:type="character" w:default="1" w:styleId="a0">
     <w:name w:val="Default Paragraph Font"/>
     <w:uiPriority w:val="1"/>
+    <w:semiHidden/>
     <w:unhideWhenUsed/>
   </w:style>
   <w:style w:type="table" w:default="1" w:styleId="a1">
@@ -2255,6 +2908,51 @@
         <w:insideV w:val="single" w:sz="4" w:space="0" w:color="auto"/>
       </w:tblBorders>
     </w:tblPr>
+  </w:style>
+  <w:style w:type="character" w:customStyle="1" w:styleId="30">
+    <w:name w:val="Заголовок 3 Знак"/>
+    <w:basedOn w:val="a0"/>
+    <w:link w:val="3"/>
+    <w:uiPriority w:val="9"/>
+    <w:rsid w:val="00D40039"/>
+    <w:rPr>
+      <w:rFonts w:ascii="Times New Roman" w:eastAsia="Times New Roman" w:hAnsi="Times New Roman" w:cs="Times New Roman"/>
+      <w:b/>
+      <w:bCs/>
+      <w:sz w:val="27"/>
+      <w:szCs w:val="27"/>
+      <w:lang w:eastAsia="ru-RU"/>
+    </w:rPr>
+  </w:style>
+  <w:style w:type="paragraph" w:styleId="a4">
+    <w:name w:val="Normal (Web)"/>
+    <w:basedOn w:val="a"/>
+    <w:uiPriority w:val="99"/>
+    <w:semiHidden/>
+    <w:unhideWhenUsed/>
+    <w:rsid w:val="00D40039"/>
+    <w:pPr>
+      <w:spacing w:before="100" w:beforeAutospacing="1" w:after="100" w:afterAutospacing="1" w:line="240" w:lineRule="auto"/>
+    </w:pPr>
+    <w:rPr>
+      <w:rFonts w:ascii="Times New Roman" w:eastAsia="Times New Roman" w:hAnsi="Times New Roman" w:cs="Times New Roman"/>
+      <w:sz w:val="24"/>
+      <w:szCs w:val="24"/>
+      <w:lang w:eastAsia="ru-RU"/>
+    </w:rPr>
+  </w:style>
+  <w:style w:type="character" w:styleId="HTML">
+    <w:name w:val="HTML Code"/>
+    <w:basedOn w:val="a0"/>
+    <w:uiPriority w:val="99"/>
+    <w:semiHidden/>
+    <w:unhideWhenUsed/>
+    <w:rsid w:val="00D40039"/>
+    <w:rPr>
+      <w:rFonts w:ascii="Courier New" w:eastAsia="Times New Roman" w:hAnsi="Courier New" w:cs="Courier New"/>
+      <w:sz w:val="20"/>
+      <w:szCs w:val="20"/>
+    </w:rPr>
   </w:style>
 </w:styles>
 </file>

</xml_diff>